<commit_message>
Se agrega el nuevo formato y el formato antiguo
</commit_message>
<xml_diff>
--- a/plantilla.docx
+++ b/plantilla.docx
@@ -1,6 +1,6 @@
 
 <file path=word/document.xml><?xml version="1.0" encoding="utf-8"?>
-<w:document xmlns:wpc="http://schemas.microsoft.com/office/word/2010/wordprocessingCanvas" xmlns:cx="http://schemas.microsoft.com/office/drawing/2014/chartex" xmlns:mc="http://schemas.openxmlformats.org/markup-compatibility/2006" xmlns:o="urn:schemas-microsoft-com:office:office" xmlns:r="http://schemas.openxmlformats.org/officeDocument/2006/relationships" xmlns:m="http://schemas.openxmlformats.org/officeDocument/2006/math" xmlns:v="urn:schemas-microsoft-com:vml" xmlns:wp14="http://schemas.microsoft.com/office/word/2010/wordprocessingDrawing" xmlns:wp="http://schemas.openxmlformats.org/drawingml/2006/wordprocessingDrawing" xmlns:w10="urn:schemas-microsoft-com:office:word" xmlns:w="http://schemas.openxmlformats.org/wordprocessingml/2006/main" xmlns:w14="http://schemas.microsoft.com/office/word/2010/wordml" xmlns:w15="http://schemas.microsoft.com/office/word/2012/wordml" xmlns:w16se="http://schemas.microsoft.com/office/word/2015/wordml/symex" xmlns:wpg="http://schemas.microsoft.com/office/word/2010/wordprocessingGroup" xmlns:wpi="http://schemas.microsoft.com/office/word/2010/wordprocessingInk" xmlns:wne="http://schemas.microsoft.com/office/word/2006/wordml" xmlns:wps="http://schemas.microsoft.com/office/word/2010/wordprocessingShape" mc:Ignorable="w14 w15 w16se wp14">
+<w:document xmlns:wpc="http://schemas.microsoft.com/office/word/2010/wordprocessingCanvas" xmlns:cx="http://schemas.microsoft.com/office/drawing/2014/chartex" xmlns:cx1="http://schemas.microsoft.com/office/drawing/2015/9/8/chartex" xmlns:cx2="http://schemas.microsoft.com/office/drawing/2015/10/21/chartex" xmlns:cx3="http://schemas.microsoft.com/office/drawing/2016/5/9/chartex" xmlns:cx4="http://schemas.microsoft.com/office/drawing/2016/5/10/chartex" xmlns:cx5="http://schemas.microsoft.com/office/drawing/2016/5/11/chartex" xmlns:cx6="http://schemas.microsoft.com/office/drawing/2016/5/12/chartex" xmlns:cx7="http://schemas.microsoft.com/office/drawing/2016/5/13/chartex" xmlns:cx8="http://schemas.microsoft.com/office/drawing/2016/5/14/chartex" xmlns:mc="http://schemas.openxmlformats.org/markup-compatibility/2006" xmlns:aink="http://schemas.microsoft.com/office/drawing/2016/ink" xmlns:am3d="http://schemas.microsoft.com/office/drawing/2017/model3d" xmlns:o="urn:schemas-microsoft-com:office:office" xmlns:oel="http://schemas.microsoft.com/office/2019/extlst" xmlns:r="http://schemas.openxmlformats.org/officeDocument/2006/relationships" xmlns:m="http://schemas.openxmlformats.org/officeDocument/2006/math" xmlns:v="urn:schemas-microsoft-com:vml" xmlns:wp14="http://schemas.microsoft.com/office/word/2010/wordprocessingDrawing" xmlns:wp="http://schemas.openxmlformats.org/drawingml/2006/wordprocessingDrawing" xmlns:w10="urn:schemas-microsoft-com:office:word" xmlns:w="http://schemas.openxmlformats.org/wordprocessingml/2006/main" xmlns:w14="http://schemas.microsoft.com/office/word/2010/wordml" xmlns:w15="http://schemas.microsoft.com/office/word/2012/wordml" xmlns:w16cex="http://schemas.microsoft.com/office/word/2018/wordml/cex" xmlns:w16cid="http://schemas.microsoft.com/office/word/2016/wordml/cid" xmlns:w16="http://schemas.microsoft.com/office/word/2018/wordml" xmlns:w16sdtdh="http://schemas.microsoft.com/office/word/2020/wordml/sdtdatahash" xmlns:w16se="http://schemas.microsoft.com/office/word/2015/wordml/symex" xmlns:wpg="http://schemas.microsoft.com/office/word/2010/wordprocessingGroup" xmlns:wpi="http://schemas.microsoft.com/office/word/2010/wordprocessingInk" xmlns:wne="http://schemas.microsoft.com/office/word/2006/wordml" xmlns:wps="http://schemas.microsoft.com/office/word/2010/wordprocessingShape" mc:Ignorable="w14 w15 w16se w16cid w16 w16cex w16sdtdh wp14">
   <w:body>
     <w:tbl>
       <w:tblPr>
@@ -477,13 +477,41 @@
               </w:rPr>
               <w:t xml:space="preserve">         </w:t>
             </w:r>
+            <w:proofErr w:type="spellStart"/>
             <w:r>
               <w:rPr>
                 <w:rFonts w:ascii="Arial MT"/>
                 <w:b w:val="0"/>
                 <w:color w:val="808080" w:themeColor="background1" w:themeShade="80"/>
               </w:rPr>
-              <w:t>idCIF: {{idCIF}}</w:t>
+              <w:t>idCIF</w:t>
+            </w:r>
+            <w:proofErr w:type="spellEnd"/>
+            <w:r>
+              <w:rPr>
+                <w:rFonts w:ascii="Arial MT"/>
+                <w:b w:val="0"/>
+                <w:color w:val="808080" w:themeColor="background1" w:themeShade="80"/>
+              </w:rPr>
+              <w:t>: {{</w:t>
+            </w:r>
+            <w:proofErr w:type="spellStart"/>
+            <w:r>
+              <w:rPr>
+                <w:rFonts w:ascii="Arial MT"/>
+                <w:b w:val="0"/>
+                <w:color w:val="808080" w:themeColor="background1" w:themeShade="80"/>
+              </w:rPr>
+              <w:t>idCIF</w:t>
+            </w:r>
+            <w:proofErr w:type="spellEnd"/>
+            <w:r>
+              <w:rPr>
+                <w:rFonts w:ascii="Arial MT"/>
+                <w:b w:val="0"/>
+                <w:color w:val="808080" w:themeColor="background1" w:themeShade="80"/>
+              </w:rPr>
+              <w:t>}}</w:t>
             </w:r>
           </w:p>
           <w:p>
@@ -583,7 +611,7 @@
                 <w:lang w:val="es-MX" w:eastAsia="es-MX"/>
               </w:rPr>
               <w:drawing>
-                <wp:anchor distT="0" distB="0" distL="114300" distR="114300" simplePos="0" relativeHeight="487599616" behindDoc="1" locked="0" layoutInCell="1" allowOverlap="1" wp14:anchorId="565006D1" wp14:editId="334763DE">
+                <wp:anchor distT="0" distB="0" distL="114300" distR="114300" simplePos="0" relativeHeight="487599616" behindDoc="1" locked="0" layoutInCell="1" allowOverlap="1" wp14:anchorId="565006D1" wp14:editId="02ADCF74">
                   <wp:simplePos x="0" y="0"/>
                   <wp:positionH relativeFrom="column">
                     <wp:posOffset>-32456</wp:posOffset>
@@ -834,8 +862,6 @@
             </w:r>
           </w:p>
         </w:tc>
-        <w:bookmarkStart w:id="0" w:name="_GoBack"/>
-        <w:bookmarkEnd w:id="0"/>
       </w:tr>
     </w:tbl>
     <w:p>
@@ -1702,6 +1728,7 @@
               </w:rPr>
               <w:t>Postal</w:t>
             </w:r>
+            <w:proofErr w:type="gramStart"/>
             <w:r>
               <w:rPr>
                 <w:spacing w:val="-2"/>
@@ -1731,7 +1758,16 @@
                 <w:spacing w:val="-2"/>
                 <w:sz w:val="16"/>
               </w:rPr>
-              <w:t>{{CODIGOPOSTAL}}</w:t>
+              <w:t>{</w:t>
+            </w:r>
+            <w:proofErr w:type="gramEnd"/>
+            <w:r>
+              <w:rPr>
+                <w:bCs/>
+                <w:spacing w:val="-2"/>
+                <w:sz w:val="16"/>
+              </w:rPr>
+              <w:t>{CODIGOPOSTAL}}</w:t>
             </w:r>
           </w:p>
         </w:tc>
@@ -2256,9 +2292,10 @@
           <w:footerReference w:type="default" r:id="rId9"/>
           <w:type w:val="continuous"/>
           <w:pgSz w:w="12240" w:h="15840"/>
-          <w:pgMar w:top="1680" w:right="360" w:bottom="2700" w:left="360" w:header="720" w:footer="2502" w:gutter="0"/>
+          <w:pgMar w:top="2269" w:right="360" w:bottom="142" w:left="360" w:header="607" w:footer="1395" w:gutter="0"/>
           <w:pgNumType w:start="1"/>
           <w:cols w:space="720"/>
+          <w:docGrid w:linePitch="299"/>
         </w:sectPr>
       </w:pPr>
     </w:p>
@@ -2351,7 +2388,7 @@
                 <v:stroke joinstyle="miter"/>
                 <v:path gradientshapeok="t" o:connecttype="rect"/>
               </v:shapetype>
-              <v:shape id="Textbox 15" o:spid="_x0000_s1026" type="#_x0000_t202" style="width:550pt;height:20.85pt;visibility:visible;mso-wrap-style:square;mso-left-percent:-10001;mso-top-percent:-10001;mso-position-horizontal:absolute;mso-position-horizontal-relative:char;mso-position-vertical:absolute;mso-position-vertical-relative:line;mso-left-percent:-10001;mso-top-percent:-10001;v-text-anchor:top" o:gfxdata="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" filled="f" strokeweight="0">
+              <v:shape id="Textbox 15" o:spid="_x0000_s1026" type="#_x0000_t202" style="width:550pt;height:20.85pt;visibility:visible;mso-wrap-style:square;mso-left-percent:-10001;mso-top-percent:-10001;mso-position-horizontal:absolute;mso-position-horizontal-relative:char;mso-position-vertical:absolute;mso-position-vertical-relative:line;mso-left-percent:-10001;mso-top-percent:-10001;v-text-anchor:top" o:gfxdata="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" filled="f" strokeweight="0">
                 <v:path arrowok="t"/>
                 <v:textbox inset="0,0,0,0">
                   <w:txbxContent>
@@ -3285,12 +3322,30 @@
           <w:b w:val="0"/>
           <w:sz w:val="20"/>
         </w:rPr>
-        <w:t>[INSERTAR_validador_AQUI]</w:t>
+        <w:t>[</w:t>
+      </w:r>
+      <w:proofErr w:type="spellStart"/>
+      <w:r>
+        <w:rPr>
+          <w:rFonts w:ascii="Arial MT"/>
+          <w:b w:val="0"/>
+          <w:sz w:val="20"/>
+        </w:rPr>
+        <w:t>INSERTAR_validador_AQUI</w:t>
+      </w:r>
+      <w:proofErr w:type="spellEnd"/>
+      <w:r>
+        <w:rPr>
+          <w:rFonts w:ascii="Arial MT"/>
+          <w:b w:val="0"/>
+          <w:sz w:val="20"/>
+        </w:rPr>
+        <w:t>]</w:t>
       </w:r>
     </w:p>
     <w:sectPr>
       <w:pgSz w:w="12240" w:h="15840"/>
-      <w:pgMar w:top="1680" w:right="360" w:bottom="2700" w:left="360" w:header="720" w:footer="2502" w:gutter="0"/>
+      <w:pgMar w:top="2269" w:right="360" w:bottom="2700" w:left="360" w:header="720" w:footer="2502" w:gutter="0"/>
       <w:cols w:space="720"/>
     </w:sectPr>
   </w:body>
@@ -3298,7 +3353,7 @@
 </file>
 
 <file path=word/endnotes.xml><?xml version="1.0" encoding="utf-8"?>
-<w:endnotes xmlns:wpc="http://schemas.microsoft.com/office/word/2010/wordprocessingCanvas" xmlns:cx="http://schemas.microsoft.com/office/drawing/2014/chartex" xmlns:mc="http://schemas.openxmlformats.org/markup-compatibility/2006" xmlns:o="urn:schemas-microsoft-com:office:office" xmlns:r="http://schemas.openxmlformats.org/officeDocument/2006/relationships" xmlns:m="http://schemas.openxmlformats.org/officeDocument/2006/math" xmlns:v="urn:schemas-microsoft-com:vml" xmlns:wp14="http://schemas.microsoft.com/office/word/2010/wordprocessingDrawing" xmlns:wp="http://schemas.openxmlformats.org/drawingml/2006/wordprocessingDrawing" xmlns:w10="urn:schemas-microsoft-com:office:word" xmlns:w="http://schemas.openxmlformats.org/wordprocessingml/2006/main" xmlns:w14="http://schemas.microsoft.com/office/word/2010/wordml" xmlns:w15="http://schemas.microsoft.com/office/word/2012/wordml" xmlns:w16se="http://schemas.microsoft.com/office/word/2015/wordml/symex" xmlns:wpg="http://schemas.microsoft.com/office/word/2010/wordprocessingGroup" xmlns:wpi="http://schemas.microsoft.com/office/word/2010/wordprocessingInk" xmlns:wne="http://schemas.microsoft.com/office/word/2006/wordml" xmlns:wps="http://schemas.microsoft.com/office/word/2010/wordprocessingShape" mc:Ignorable="w14 w15 w16se wp14">
+<w:endnotes xmlns:wpc="http://schemas.microsoft.com/office/word/2010/wordprocessingCanvas" xmlns:cx="http://schemas.microsoft.com/office/drawing/2014/chartex" xmlns:cx1="http://schemas.microsoft.com/office/drawing/2015/9/8/chartex" xmlns:cx2="http://schemas.microsoft.com/office/drawing/2015/10/21/chartex" xmlns:cx3="http://schemas.microsoft.com/office/drawing/2016/5/9/chartex" xmlns:cx4="http://schemas.microsoft.com/office/drawing/2016/5/10/chartex" xmlns:cx5="http://schemas.microsoft.com/office/drawing/2016/5/11/chartex" xmlns:cx6="http://schemas.microsoft.com/office/drawing/2016/5/12/chartex" xmlns:cx7="http://schemas.microsoft.com/office/drawing/2016/5/13/chartex" xmlns:cx8="http://schemas.microsoft.com/office/drawing/2016/5/14/chartex" xmlns:mc="http://schemas.openxmlformats.org/markup-compatibility/2006" xmlns:aink="http://schemas.microsoft.com/office/drawing/2016/ink" xmlns:am3d="http://schemas.microsoft.com/office/drawing/2017/model3d" xmlns:o="urn:schemas-microsoft-com:office:office" xmlns:oel="http://schemas.microsoft.com/office/2019/extlst" xmlns:r="http://schemas.openxmlformats.org/officeDocument/2006/relationships" xmlns:m="http://schemas.openxmlformats.org/officeDocument/2006/math" xmlns:v="urn:schemas-microsoft-com:vml" xmlns:wp14="http://schemas.microsoft.com/office/word/2010/wordprocessingDrawing" xmlns:wp="http://schemas.openxmlformats.org/drawingml/2006/wordprocessingDrawing" xmlns:w10="urn:schemas-microsoft-com:office:word" xmlns:w="http://schemas.openxmlformats.org/wordprocessingml/2006/main" xmlns:w14="http://schemas.microsoft.com/office/word/2010/wordml" xmlns:w15="http://schemas.microsoft.com/office/word/2012/wordml" xmlns:w16cex="http://schemas.microsoft.com/office/word/2018/wordml/cex" xmlns:w16cid="http://schemas.microsoft.com/office/word/2016/wordml/cid" xmlns:w16="http://schemas.microsoft.com/office/word/2018/wordml" xmlns:w16sdtdh="http://schemas.microsoft.com/office/word/2020/wordml/sdtdatahash" xmlns:w16se="http://schemas.microsoft.com/office/word/2015/wordml/symex" xmlns:wpg="http://schemas.microsoft.com/office/word/2010/wordprocessingGroup" xmlns:wpi="http://schemas.microsoft.com/office/word/2010/wordprocessingInk" xmlns:wne="http://schemas.microsoft.com/office/word/2006/wordml" xmlns:wps="http://schemas.microsoft.com/office/word/2010/wordprocessingShape" mc:Ignorable="w14 w15 w16se w16cid w16 w16cex w16sdtdh wp14">
   <w:endnote w:type="separator" w:id="-1">
     <w:p>
       <w:r>
@@ -3317,7 +3372,7 @@
 </file>
 
 <file path=word/footer1.xml><?xml version="1.0" encoding="utf-8"?>
-<w:ftr xmlns:wpc="http://schemas.microsoft.com/office/word/2010/wordprocessingCanvas" xmlns:cx="http://schemas.microsoft.com/office/drawing/2014/chartex" xmlns:mc="http://schemas.openxmlformats.org/markup-compatibility/2006" xmlns:o="urn:schemas-microsoft-com:office:office" xmlns:r="http://schemas.openxmlformats.org/officeDocument/2006/relationships" xmlns:m="http://schemas.openxmlformats.org/officeDocument/2006/math" xmlns:v="urn:schemas-microsoft-com:vml" xmlns:wp14="http://schemas.microsoft.com/office/word/2010/wordprocessingDrawing" xmlns:wp="http://schemas.openxmlformats.org/drawingml/2006/wordprocessingDrawing" xmlns:w10="urn:schemas-microsoft-com:office:word" xmlns:w="http://schemas.openxmlformats.org/wordprocessingml/2006/main" xmlns:w14="http://schemas.microsoft.com/office/word/2010/wordml" xmlns:w15="http://schemas.microsoft.com/office/word/2012/wordml" xmlns:w16se="http://schemas.microsoft.com/office/word/2015/wordml/symex" xmlns:wpg="http://schemas.microsoft.com/office/word/2010/wordprocessingGroup" xmlns:wpi="http://schemas.microsoft.com/office/word/2010/wordprocessingInk" xmlns:wne="http://schemas.microsoft.com/office/word/2006/wordml" xmlns:wps="http://schemas.microsoft.com/office/word/2010/wordprocessingShape" mc:Ignorable="w14 w15 w16se wp14">
+<w:ftr xmlns:wpc="http://schemas.microsoft.com/office/word/2010/wordprocessingCanvas" xmlns:cx="http://schemas.microsoft.com/office/drawing/2014/chartex" xmlns:cx1="http://schemas.microsoft.com/office/drawing/2015/9/8/chartex" xmlns:cx2="http://schemas.microsoft.com/office/drawing/2015/10/21/chartex" xmlns:cx3="http://schemas.microsoft.com/office/drawing/2016/5/9/chartex" xmlns:cx4="http://schemas.microsoft.com/office/drawing/2016/5/10/chartex" xmlns:cx5="http://schemas.microsoft.com/office/drawing/2016/5/11/chartex" xmlns:cx6="http://schemas.microsoft.com/office/drawing/2016/5/12/chartex" xmlns:cx7="http://schemas.microsoft.com/office/drawing/2016/5/13/chartex" xmlns:cx8="http://schemas.microsoft.com/office/drawing/2016/5/14/chartex" xmlns:mc="http://schemas.openxmlformats.org/markup-compatibility/2006" xmlns:aink="http://schemas.microsoft.com/office/drawing/2016/ink" xmlns:am3d="http://schemas.microsoft.com/office/drawing/2017/model3d" xmlns:o="urn:schemas-microsoft-com:office:office" xmlns:oel="http://schemas.microsoft.com/office/2019/extlst" xmlns:r="http://schemas.openxmlformats.org/officeDocument/2006/relationships" xmlns:m="http://schemas.openxmlformats.org/officeDocument/2006/math" xmlns:v="urn:schemas-microsoft-com:vml" xmlns:wp14="http://schemas.microsoft.com/office/word/2010/wordprocessingDrawing" xmlns:wp="http://schemas.openxmlformats.org/drawingml/2006/wordprocessingDrawing" xmlns:w10="urn:schemas-microsoft-com:office:word" xmlns:w="http://schemas.openxmlformats.org/wordprocessingml/2006/main" xmlns:w14="http://schemas.microsoft.com/office/word/2010/wordml" xmlns:w15="http://schemas.microsoft.com/office/word/2012/wordml" xmlns:w16cex="http://schemas.microsoft.com/office/word/2018/wordml/cex" xmlns:w16cid="http://schemas.microsoft.com/office/word/2016/wordml/cid" xmlns:w16="http://schemas.microsoft.com/office/word/2018/wordml" xmlns:w16sdtdh="http://schemas.microsoft.com/office/word/2020/wordml/sdtdatahash" xmlns:w16se="http://schemas.microsoft.com/office/word/2015/wordml/symex" xmlns:wpg="http://schemas.microsoft.com/office/word/2010/wordprocessingGroup" xmlns:wpi="http://schemas.microsoft.com/office/word/2010/wordprocessingInk" xmlns:wne="http://schemas.microsoft.com/office/word/2006/wordml" xmlns:wps="http://schemas.microsoft.com/office/word/2010/wordprocessingShape" mc:Ignorable="w14 w15 w16se w16cid w16 w16cex w16sdtdh wp14">
   <w:p>
     <w:pPr>
       <w:pStyle w:val="Textoindependiente"/>
@@ -3335,136 +3390,15 @@
         <w:lang w:val="es-MX" w:eastAsia="es-MX"/>
       </w:rPr>
       <mc:AlternateContent>
-        <mc:Choice Requires="wpg">
+        <mc:Choice Requires="wps">
           <w:drawing>
-            <wp:anchor distT="0" distB="0" distL="0" distR="0" simplePos="0" relativeHeight="487457792" behindDoc="1" locked="0" layoutInCell="1" allowOverlap="1" wp14:anchorId="1971F294" wp14:editId="4373D488">
+            <wp:anchor distT="0" distB="0" distL="0" distR="0" simplePos="0" relativeHeight="487458304" behindDoc="1" locked="0" layoutInCell="1" allowOverlap="1" wp14:anchorId="4DAD4B29" wp14:editId="21222EE9">
               <wp:simplePos x="0" y="0"/>
               <wp:positionH relativeFrom="page">
-                <wp:posOffset>381000</wp:posOffset>
+                <wp:posOffset>6389370</wp:posOffset>
               </wp:positionH>
               <wp:positionV relativeFrom="page">
-                <wp:posOffset>8458212</wp:posOffset>
-              </wp:positionV>
-              <wp:extent cx="6985000" cy="925194"/>
-              <wp:effectExtent l="0" t="0" r="0" b="0"/>
-              <wp:wrapNone/>
-              <wp:docPr id="2" name="Group 2"/>
-              <wp:cNvGraphicFramePr>
-                <a:graphicFrameLocks xmlns:a="http://schemas.openxmlformats.org/drawingml/2006/main"/>
-              </wp:cNvGraphicFramePr>
-              <a:graphic xmlns:a="http://schemas.openxmlformats.org/drawingml/2006/main">
-                <a:graphicData uri="http://schemas.microsoft.com/office/word/2010/wordprocessingGroup">
-                  <wpg:wgp>
-                    <wpg:cNvGrpSpPr>
-                      <a:grpSpLocks/>
-                    </wpg:cNvGrpSpPr>
-                    <wpg:grpSpPr>
-                      <a:xfrm>
-                        <a:off x="0" y="0"/>
-                        <a:ext cx="6985000" cy="925194"/>
-                        <a:chOff x="0" y="0"/>
-                        <a:chExt cx="6985000" cy="925194"/>
-                      </a:xfrm>
-                    </wpg:grpSpPr>
-                    <pic:pic xmlns:pic="http://schemas.openxmlformats.org/drawingml/2006/picture">
-                      <pic:nvPicPr>
-                        <pic:cNvPr id="3" name="Image 3"/>
-                        <pic:cNvPicPr/>
-                      </pic:nvPicPr>
-                      <pic:blipFill>
-                        <a:blip r:embed="rId1" cstate="print"/>
-                        <a:stretch>
-                          <a:fillRect/>
-                        </a:stretch>
-                      </pic:blipFill>
-                      <pic:spPr>
-                        <a:xfrm>
-                          <a:off x="0" y="0"/>
-                          <a:ext cx="6984987" cy="802220"/>
-                        </a:xfrm>
-                        <a:prstGeom prst="rect">
-                          <a:avLst/>
-                        </a:prstGeom>
-                      </pic:spPr>
-                    </pic:pic>
-                    <pic:pic xmlns:pic="http://schemas.openxmlformats.org/drawingml/2006/picture">
-                      <pic:nvPicPr>
-                        <pic:cNvPr id="4" name="Image 4"/>
-                        <pic:cNvPicPr/>
-                      </pic:nvPicPr>
-                      <pic:blipFill>
-                        <a:blip r:embed="rId2" cstate="print"/>
-                        <a:stretch>
-                          <a:fillRect/>
-                        </a:stretch>
-                      </pic:blipFill>
-                      <pic:spPr>
-                        <a:xfrm>
-                          <a:off x="0" y="0"/>
-                          <a:ext cx="6985000" cy="924572"/>
-                        </a:xfrm>
-                        <a:prstGeom prst="rect">
-                          <a:avLst/>
-                        </a:prstGeom>
-                      </pic:spPr>
-                    </pic:pic>
-                  </wpg:wgp>
-                </a:graphicData>
-              </a:graphic>
-            </wp:anchor>
-          </w:drawing>
-        </mc:Choice>
-        <mc:Fallback xmlns:w16sdtfl="http://schemas.microsoft.com/office/word/2024/wordml/sdtformatlock" xmlns:w16sdtdh="http://schemas.microsoft.com/office/word/2020/wordml/sdtdatahash" xmlns:w16du="http://schemas.microsoft.com/office/word/2023/wordml/word16du" xmlns:w16="http://schemas.microsoft.com/office/word/2018/wordml" xmlns:w16cid="http://schemas.microsoft.com/office/word/2016/wordml/cid" xmlns:w16cex="http://schemas.microsoft.com/office/word/2018/wordml/cex" xmlns:oel="http://schemas.microsoft.com/office/2019/extlst" xmlns:am3d="http://schemas.microsoft.com/office/drawing/2017/model3d" xmlns:aink="http://schemas.microsoft.com/office/drawing/2016/ink" xmlns:cx8="http://schemas.microsoft.com/office/drawing/2016/5/14/chartex" xmlns:cx7="http://schemas.microsoft.com/office/drawing/2016/5/13/chartex" xmlns:cx6="http://schemas.microsoft.com/office/drawing/2016/5/12/chartex" xmlns:cx5="http://schemas.microsoft.com/office/drawing/2016/5/11/chartex" xmlns:cx4="http://schemas.microsoft.com/office/drawing/2016/5/10/chartex" xmlns:cx3="http://schemas.microsoft.com/office/drawing/2016/5/9/chartex" xmlns:cx2="http://schemas.microsoft.com/office/drawing/2015/10/21/chartex" xmlns:cx1="http://schemas.microsoft.com/office/drawing/2015/9/8/chartex">
-          <w:pict>
-            <v:group w14:anchorId="15506775" id="Group 2" o:spid="_x0000_s1026" style="position:absolute;margin-left:30pt;margin-top:666pt;width:550pt;height:72.85pt;z-index:-15858688;mso-wrap-distance-left:0;mso-wrap-distance-right:0;mso-position-horizontal-relative:page;mso-position-vertical-relative:page" coordsize="69850,9251" o:gfxdata="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">
-              <v:shapetype id="_x0000_t75" coordsize="21600,21600" o:spt="75" o:preferrelative="t" path="m@4@5l@4@11@9@11@9@5xe" filled="f" stroked="f">
-                <v:stroke joinstyle="miter"/>
-                <v:formulas>
-                  <v:f eqn="if lineDrawn pixelLineWidth 0"/>
-                  <v:f eqn="sum @0 1 0"/>
-                  <v:f eqn="sum 0 0 @1"/>
-                  <v:f eqn="prod @2 1 2"/>
-                  <v:f eqn="prod @3 21600 pixelWidth"/>
-                  <v:f eqn="prod @3 21600 pixelHeight"/>
-                  <v:f eqn="sum @0 0 1"/>
-                  <v:f eqn="prod @6 1 2"/>
-                  <v:f eqn="prod @7 21600 pixelWidth"/>
-                  <v:f eqn="sum @8 21600 0"/>
-                  <v:f eqn="prod @7 21600 pixelHeight"/>
-                  <v:f eqn="sum @10 21600 0"/>
-                </v:formulas>
-                <v:path o:extrusionok="f" gradientshapeok="t" o:connecttype="rect"/>
-                <o:lock v:ext="edit" aspectratio="t"/>
-              </v:shapetype>
-              <v:shape id="Image 3" o:spid="_x0000_s1027" type="#_x0000_t75" style="position:absolute;width:69849;height:8022;visibility:visible;mso-wrap-style:square" o:gfxdata="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">
-                <v:imagedata r:id="rId3" o:title=""/>
-              </v:shape>
-              <v:shape id="Image 4" o:spid="_x0000_s1028" type="#_x0000_t75" style="position:absolute;width:69850;height:9245;visibility:visible;mso-wrap-style:square" o:gfxdata="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">
-                <v:imagedata r:id="rId4" o:title=""/>
-              </v:shape>
-              <w10:wrap anchorx="page" anchory="page"/>
-            </v:group>
-          </w:pict>
-        </mc:Fallback>
-      </mc:AlternateContent>
-    </w:r>
-    <w:r>
-      <w:rPr>
-        <w:b w:val="0"/>
-        <w:noProof/>
-        <w:sz w:val="20"/>
-        <w:lang w:val="es-MX" w:eastAsia="es-MX"/>
-      </w:rPr>
-      <mc:AlternateContent>
-        <mc:Choice Requires="wps">
-          <w:drawing>
-            <wp:anchor distT="0" distB="0" distL="0" distR="0" simplePos="0" relativeHeight="487458304" behindDoc="1" locked="0" layoutInCell="1" allowOverlap="1" wp14:anchorId="4DAD4B29" wp14:editId="0C293100">
-              <wp:simplePos x="0" y="0"/>
-              <wp:positionH relativeFrom="page">
-                <wp:posOffset>6532371</wp:posOffset>
-              </wp:positionH>
-              <wp:positionV relativeFrom="page">
-                <wp:posOffset>8329876</wp:posOffset>
+                <wp:posOffset>9805670</wp:posOffset>
               </wp:positionV>
               <wp:extent cx="838835" cy="139065"/>
               <wp:effectExtent l="0" t="0" r="0" b="0"/>
@@ -3495,66 +3429,110 @@
                             <w:pStyle w:val="Textoindependiente"/>
                             <w:spacing w:before="14"/>
                             <w:ind w:left="20"/>
+                            <w:rPr>
+                              <w:rFonts w:ascii="Lucida Sans Unicode" w:hAnsi="Lucida Sans Unicode" w:cs="Lucida Sans Unicode"/>
+                              <w:b w:val="0"/>
+                              <w:bCs w:val="0"/>
+                            </w:rPr>
                           </w:pPr>
                           <w:r>
+                            <w:rPr>
+                              <w:rFonts w:ascii="Lucida Sans Unicode" w:hAnsi="Lucida Sans Unicode" w:cs="Lucida Sans Unicode"/>
+                              <w:b w:val="0"/>
+                              <w:bCs w:val="0"/>
+                            </w:rPr>
                             <w:t>Página</w:t>
                           </w:r>
                           <w:r>
                             <w:rPr>
+                              <w:rFonts w:ascii="Lucida Sans Unicode" w:hAnsi="Lucida Sans Unicode" w:cs="Lucida Sans Unicode"/>
+                              <w:b w:val="0"/>
+                              <w:bCs w:val="0"/>
                               <w:spacing w:val="44"/>
                             </w:rPr>
                             <w:t xml:space="preserve"> </w:t>
                           </w:r>
                           <w:r>
-                            <w:t>[</w:t>
-                          </w:r>
-                          <w:r>
+                            <w:rPr>
+                              <w:rFonts w:ascii="Lucida Sans Unicode" w:hAnsi="Lucida Sans Unicode" w:cs="Lucida Sans Unicode"/>
+                              <w:b w:val="0"/>
+                              <w:bCs w:val="0"/>
+                            </w:rPr>
                             <w:fldChar w:fldCharType="begin"/>
                           </w:r>
                           <w:r>
+                            <w:rPr>
+                              <w:rFonts w:ascii="Lucida Sans Unicode" w:hAnsi="Lucida Sans Unicode" w:cs="Lucida Sans Unicode"/>
+                              <w:b w:val="0"/>
+                              <w:bCs w:val="0"/>
+                            </w:rPr>
                             <w:instrText xml:space="preserve"> PAGE </w:instrText>
                           </w:r>
                           <w:r>
+                            <w:rPr>
+                              <w:rFonts w:ascii="Lucida Sans Unicode" w:hAnsi="Lucida Sans Unicode" w:cs="Lucida Sans Unicode"/>
+                              <w:b w:val="0"/>
+                              <w:bCs w:val="0"/>
+                            </w:rPr>
                             <w:fldChar w:fldCharType="separate"/>
                           </w:r>
                           <w:r>
                             <w:rPr>
+                              <w:rFonts w:ascii="Lucida Sans Unicode" w:hAnsi="Lucida Sans Unicode" w:cs="Lucida Sans Unicode"/>
+                              <w:b w:val="0"/>
+                              <w:bCs w:val="0"/>
                               <w:noProof/>
                             </w:rPr>
                             <w:t>2</w:t>
                           </w:r>
                           <w:r>
+                            <w:rPr>
+                              <w:rFonts w:ascii="Lucida Sans Unicode" w:hAnsi="Lucida Sans Unicode" w:cs="Lucida Sans Unicode"/>
+                              <w:b w:val="0"/>
+                              <w:bCs w:val="0"/>
+                            </w:rPr>
                             <w:fldChar w:fldCharType="end"/>
                           </w:r>
                           <w:r>
-                            <w:t xml:space="preserve">] de </w:t>
+                            <w:rPr>
+                              <w:rFonts w:ascii="Lucida Sans Unicode" w:hAnsi="Lucida Sans Unicode" w:cs="Lucida Sans Unicode"/>
+                              <w:b w:val="0"/>
+                              <w:bCs w:val="0"/>
+                            </w:rPr>
+                            <w:t xml:space="preserve"> de </w:t>
                           </w:r>
                           <w:r>
                             <w:rPr>
-                              <w:spacing w:val="-5"/>
-                            </w:rPr>
-                            <w:t>[</w:t>
-                          </w:r>
-                          <w:r>
-                            <w:rPr>
+                              <w:rFonts w:ascii="Lucida Sans Unicode" w:hAnsi="Lucida Sans Unicode" w:cs="Lucida Sans Unicode"/>
+                              <w:b w:val="0"/>
+                              <w:bCs w:val="0"/>
                               <w:spacing w:val="-5"/>
                             </w:rPr>
                             <w:fldChar w:fldCharType="begin"/>
                           </w:r>
                           <w:r>
                             <w:rPr>
+                              <w:rFonts w:ascii="Lucida Sans Unicode" w:hAnsi="Lucida Sans Unicode" w:cs="Lucida Sans Unicode"/>
+                              <w:b w:val="0"/>
+                              <w:bCs w:val="0"/>
                               <w:spacing w:val="-5"/>
                             </w:rPr>
                             <w:instrText xml:space="preserve"> NUMPAGES </w:instrText>
                           </w:r>
                           <w:r>
                             <w:rPr>
+                              <w:rFonts w:ascii="Lucida Sans Unicode" w:hAnsi="Lucida Sans Unicode" w:cs="Lucida Sans Unicode"/>
+                              <w:b w:val="0"/>
+                              <w:bCs w:val="0"/>
                               <w:spacing w:val="-5"/>
                             </w:rPr>
                             <w:fldChar w:fldCharType="separate"/>
                           </w:r>
                           <w:r>
                             <w:rPr>
+                              <w:rFonts w:ascii="Lucida Sans Unicode" w:hAnsi="Lucida Sans Unicode" w:cs="Lucida Sans Unicode"/>
+                              <w:b w:val="0"/>
+                              <w:bCs w:val="0"/>
                               <w:noProof/>
                               <w:spacing w:val="-5"/>
                             </w:rPr>
@@ -3562,15 +3540,12 @@
                           </w:r>
                           <w:r>
                             <w:rPr>
+                              <w:rFonts w:ascii="Lucida Sans Unicode" w:hAnsi="Lucida Sans Unicode" w:cs="Lucida Sans Unicode"/>
+                              <w:b w:val="0"/>
+                              <w:bCs w:val="0"/>
                               <w:spacing w:val="-5"/>
                             </w:rPr>
                             <w:fldChar w:fldCharType="end"/>
-                          </w:r>
-                          <w:r>
-                            <w:rPr>
-                              <w:spacing w:val="-5"/>
-                            </w:rPr>
-                            <w:t>]</w:t>
                           </w:r>
                         </w:p>
                       </w:txbxContent>
@@ -3590,8 +3565,7 @@
               <v:stroke joinstyle="miter"/>
               <v:path gradientshapeok="t" o:connecttype="rect"/>
             </v:shapetype>
-            <v:shape id="Textbox 5" o:spid="_x0000_s1027" type="#_x0000_t202" style="position:absolute;margin-left:514.35pt;margin-top:655.9pt;width:66.05pt;height:10.95pt;z-index:-15858176;visibility:visible;mso-wrap-style:square;mso-wrap-distance-left:0;mso-wrap-distance-top:0;mso-wrap-distance-right:0;mso-wrap-distance-bottom:0;mso-position-horizontal:absolute;mso-position-horizontal-relative:page;mso-position-vertical:absolute;mso-position-vertical-relative:page;v-text-anchor:top" o:gfxdata="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" filled="f" stroked="f">
-              <v:path arrowok="t"/>
+            <v:shape id="Textbox 5" o:spid="_x0000_s1027" type="#_x0000_t202" style="position:absolute;margin-left:503.1pt;margin-top:772.1pt;width:66.05pt;height:10.95pt;z-index:-15858176;visibility:visible;mso-wrap-style:square;mso-wrap-distance-left:0;mso-wrap-distance-top:0;mso-wrap-distance-right:0;mso-wrap-distance-bottom:0;mso-position-horizontal:absolute;mso-position-horizontal-relative:page;mso-position-vertical:absolute;mso-position-vertical-relative:page;v-text-anchor:top" o:gfxdata="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" filled="f" stroked="f">
               <v:textbox inset="0,0,0,0">
                 <w:txbxContent>
                   <w:p>
@@ -3599,66 +3573,110 @@
                       <w:pStyle w:val="Textoindependiente"/>
                       <w:spacing w:before="14"/>
                       <w:ind w:left="20"/>
+                      <w:rPr>
+                        <w:rFonts w:ascii="Lucida Sans Unicode" w:hAnsi="Lucida Sans Unicode" w:cs="Lucida Sans Unicode"/>
+                        <w:b w:val="0"/>
+                        <w:bCs w:val="0"/>
+                      </w:rPr>
                     </w:pPr>
                     <w:r>
+                      <w:rPr>
+                        <w:rFonts w:ascii="Lucida Sans Unicode" w:hAnsi="Lucida Sans Unicode" w:cs="Lucida Sans Unicode"/>
+                        <w:b w:val="0"/>
+                        <w:bCs w:val="0"/>
+                      </w:rPr>
                       <w:t>Página</w:t>
                     </w:r>
                     <w:r>
                       <w:rPr>
+                        <w:rFonts w:ascii="Lucida Sans Unicode" w:hAnsi="Lucida Sans Unicode" w:cs="Lucida Sans Unicode"/>
+                        <w:b w:val="0"/>
+                        <w:bCs w:val="0"/>
                         <w:spacing w:val="44"/>
                       </w:rPr>
                       <w:t xml:space="preserve"> </w:t>
                     </w:r>
                     <w:r>
-                      <w:t>[</w:t>
-                    </w:r>
-                    <w:r>
+                      <w:rPr>
+                        <w:rFonts w:ascii="Lucida Sans Unicode" w:hAnsi="Lucida Sans Unicode" w:cs="Lucida Sans Unicode"/>
+                        <w:b w:val="0"/>
+                        <w:bCs w:val="0"/>
+                      </w:rPr>
                       <w:fldChar w:fldCharType="begin"/>
                     </w:r>
                     <w:r>
+                      <w:rPr>
+                        <w:rFonts w:ascii="Lucida Sans Unicode" w:hAnsi="Lucida Sans Unicode" w:cs="Lucida Sans Unicode"/>
+                        <w:b w:val="0"/>
+                        <w:bCs w:val="0"/>
+                      </w:rPr>
                       <w:instrText xml:space="preserve"> PAGE </w:instrText>
                     </w:r>
                     <w:r>
+                      <w:rPr>
+                        <w:rFonts w:ascii="Lucida Sans Unicode" w:hAnsi="Lucida Sans Unicode" w:cs="Lucida Sans Unicode"/>
+                        <w:b w:val="0"/>
+                        <w:bCs w:val="0"/>
+                      </w:rPr>
                       <w:fldChar w:fldCharType="separate"/>
                     </w:r>
                     <w:r>
                       <w:rPr>
+                        <w:rFonts w:ascii="Lucida Sans Unicode" w:hAnsi="Lucida Sans Unicode" w:cs="Lucida Sans Unicode"/>
+                        <w:b w:val="0"/>
+                        <w:bCs w:val="0"/>
                         <w:noProof/>
                       </w:rPr>
                       <w:t>2</w:t>
                     </w:r>
                     <w:r>
+                      <w:rPr>
+                        <w:rFonts w:ascii="Lucida Sans Unicode" w:hAnsi="Lucida Sans Unicode" w:cs="Lucida Sans Unicode"/>
+                        <w:b w:val="0"/>
+                        <w:bCs w:val="0"/>
+                      </w:rPr>
                       <w:fldChar w:fldCharType="end"/>
                     </w:r>
                     <w:r>
-                      <w:t xml:space="preserve">] de </w:t>
+                      <w:rPr>
+                        <w:rFonts w:ascii="Lucida Sans Unicode" w:hAnsi="Lucida Sans Unicode" w:cs="Lucida Sans Unicode"/>
+                        <w:b w:val="0"/>
+                        <w:bCs w:val="0"/>
+                      </w:rPr>
+                      <w:t xml:space="preserve"> de </w:t>
                     </w:r>
                     <w:r>
                       <w:rPr>
-                        <w:spacing w:val="-5"/>
-                      </w:rPr>
-                      <w:t>[</w:t>
-                    </w:r>
-                    <w:r>
-                      <w:rPr>
+                        <w:rFonts w:ascii="Lucida Sans Unicode" w:hAnsi="Lucida Sans Unicode" w:cs="Lucida Sans Unicode"/>
+                        <w:b w:val="0"/>
+                        <w:bCs w:val="0"/>
                         <w:spacing w:val="-5"/>
                       </w:rPr>
                       <w:fldChar w:fldCharType="begin"/>
                     </w:r>
                     <w:r>
                       <w:rPr>
+                        <w:rFonts w:ascii="Lucida Sans Unicode" w:hAnsi="Lucida Sans Unicode" w:cs="Lucida Sans Unicode"/>
+                        <w:b w:val="0"/>
+                        <w:bCs w:val="0"/>
                         <w:spacing w:val="-5"/>
                       </w:rPr>
                       <w:instrText xml:space="preserve"> NUMPAGES </w:instrText>
                     </w:r>
                     <w:r>
                       <w:rPr>
+                        <w:rFonts w:ascii="Lucida Sans Unicode" w:hAnsi="Lucida Sans Unicode" w:cs="Lucida Sans Unicode"/>
+                        <w:b w:val="0"/>
+                        <w:bCs w:val="0"/>
                         <w:spacing w:val="-5"/>
                       </w:rPr>
                       <w:fldChar w:fldCharType="separate"/>
                     </w:r>
                     <w:r>
                       <w:rPr>
+                        <w:rFonts w:ascii="Lucida Sans Unicode" w:hAnsi="Lucida Sans Unicode" w:cs="Lucida Sans Unicode"/>
+                        <w:b w:val="0"/>
+                        <w:bCs w:val="0"/>
                         <w:noProof/>
                         <w:spacing w:val="-5"/>
                       </w:rPr>
@@ -3666,15 +3684,12 @@
                     </w:r>
                     <w:r>
                       <w:rPr>
+                        <w:rFonts w:ascii="Lucida Sans Unicode" w:hAnsi="Lucida Sans Unicode" w:cs="Lucida Sans Unicode"/>
+                        <w:b w:val="0"/>
+                        <w:bCs w:val="0"/>
                         <w:spacing w:val="-5"/>
                       </w:rPr>
                       <w:fldChar w:fldCharType="end"/>
-                    </w:r>
-                    <w:r>
-                      <w:rPr>
-                        <w:spacing w:val="-5"/>
-                      </w:rPr>
-                      <w:t>]</w:t>
                     </w:r>
                   </w:p>
                 </w:txbxContent>
@@ -3685,12 +3700,62 @@
         </mc:Fallback>
       </mc:AlternateContent>
     </w:r>
+    <w:r>
+      <w:rPr>
+        <w:b w:val="0"/>
+        <w:noProof/>
+        <w:sz w:val="20"/>
+      </w:rPr>
+      <w:drawing>
+        <wp:anchor distT="0" distB="0" distL="0" distR="0" simplePos="0" relativeHeight="487462400" behindDoc="1" locked="0" layoutInCell="1" allowOverlap="1" wp14:anchorId="68FD3393" wp14:editId="5B07C19F">
+          <wp:simplePos x="0" y="0"/>
+          <wp:positionH relativeFrom="margin">
+            <wp:posOffset>161925</wp:posOffset>
+          </wp:positionH>
+          <wp:positionV relativeFrom="page">
+            <wp:posOffset>9003665</wp:posOffset>
+          </wp:positionV>
+          <wp:extent cx="6991350" cy="737235"/>
+          <wp:effectExtent l="0" t="0" r="0" b="5715"/>
+          <wp:wrapNone/>
+          <wp:docPr id="71" name="Image 2"/>
+          <wp:cNvGraphicFramePr>
+            <a:graphicFrameLocks xmlns:a="http://schemas.openxmlformats.org/drawingml/2006/main"/>
+          </wp:cNvGraphicFramePr>
+          <a:graphic xmlns:a="http://schemas.openxmlformats.org/drawingml/2006/main">
+            <a:graphicData uri="http://schemas.openxmlformats.org/drawingml/2006/picture">
+              <pic:pic xmlns:pic="http://schemas.openxmlformats.org/drawingml/2006/picture">
+                <pic:nvPicPr>
+                  <pic:cNvPr id="2" name="Image 2"/>
+                  <pic:cNvPicPr/>
+                </pic:nvPicPr>
+                <pic:blipFill>
+                  <a:blip r:embed="rId1" cstate="print"/>
+                  <a:stretch>
+                    <a:fillRect/>
+                  </a:stretch>
+                </pic:blipFill>
+                <pic:spPr>
+                  <a:xfrm>
+                    <a:off x="0" y="0"/>
+                    <a:ext cx="6991350" cy="737235"/>
+                  </a:xfrm>
+                  <a:prstGeom prst="rect">
+                    <a:avLst/>
+                  </a:prstGeom>
+                </pic:spPr>
+              </pic:pic>
+            </a:graphicData>
+          </a:graphic>
+        </wp:anchor>
+      </w:drawing>
+    </w:r>
   </w:p>
 </w:ftr>
 </file>
 
 <file path=word/footnotes.xml><?xml version="1.0" encoding="utf-8"?>
-<w:footnotes xmlns:wpc="http://schemas.microsoft.com/office/word/2010/wordprocessingCanvas" xmlns:cx="http://schemas.microsoft.com/office/drawing/2014/chartex" xmlns:mc="http://schemas.openxmlformats.org/markup-compatibility/2006" xmlns:o="urn:schemas-microsoft-com:office:office" xmlns:r="http://schemas.openxmlformats.org/officeDocument/2006/relationships" xmlns:m="http://schemas.openxmlformats.org/officeDocument/2006/math" xmlns:v="urn:schemas-microsoft-com:vml" xmlns:wp14="http://schemas.microsoft.com/office/word/2010/wordprocessingDrawing" xmlns:wp="http://schemas.openxmlformats.org/drawingml/2006/wordprocessingDrawing" xmlns:w10="urn:schemas-microsoft-com:office:word" xmlns:w="http://schemas.openxmlformats.org/wordprocessingml/2006/main" xmlns:w14="http://schemas.microsoft.com/office/word/2010/wordml" xmlns:w15="http://schemas.microsoft.com/office/word/2012/wordml" xmlns:w16se="http://schemas.microsoft.com/office/word/2015/wordml/symex" xmlns:wpg="http://schemas.microsoft.com/office/word/2010/wordprocessingGroup" xmlns:wpi="http://schemas.microsoft.com/office/word/2010/wordprocessingInk" xmlns:wne="http://schemas.microsoft.com/office/word/2006/wordml" xmlns:wps="http://schemas.microsoft.com/office/word/2010/wordprocessingShape" mc:Ignorable="w14 w15 w16se wp14">
+<w:footnotes xmlns:wpc="http://schemas.microsoft.com/office/word/2010/wordprocessingCanvas" xmlns:cx="http://schemas.microsoft.com/office/drawing/2014/chartex" xmlns:cx1="http://schemas.microsoft.com/office/drawing/2015/9/8/chartex" xmlns:cx2="http://schemas.microsoft.com/office/drawing/2015/10/21/chartex" xmlns:cx3="http://schemas.microsoft.com/office/drawing/2016/5/9/chartex" xmlns:cx4="http://schemas.microsoft.com/office/drawing/2016/5/10/chartex" xmlns:cx5="http://schemas.microsoft.com/office/drawing/2016/5/11/chartex" xmlns:cx6="http://schemas.microsoft.com/office/drawing/2016/5/12/chartex" xmlns:cx7="http://schemas.microsoft.com/office/drawing/2016/5/13/chartex" xmlns:cx8="http://schemas.microsoft.com/office/drawing/2016/5/14/chartex" xmlns:mc="http://schemas.openxmlformats.org/markup-compatibility/2006" xmlns:aink="http://schemas.microsoft.com/office/drawing/2016/ink" xmlns:am3d="http://schemas.microsoft.com/office/drawing/2017/model3d" xmlns:o="urn:schemas-microsoft-com:office:office" xmlns:oel="http://schemas.microsoft.com/office/2019/extlst" xmlns:r="http://schemas.openxmlformats.org/officeDocument/2006/relationships" xmlns:m="http://schemas.openxmlformats.org/officeDocument/2006/math" xmlns:v="urn:schemas-microsoft-com:vml" xmlns:wp14="http://schemas.microsoft.com/office/word/2010/wordprocessingDrawing" xmlns:wp="http://schemas.openxmlformats.org/drawingml/2006/wordprocessingDrawing" xmlns:w10="urn:schemas-microsoft-com:office:word" xmlns:w="http://schemas.openxmlformats.org/wordprocessingml/2006/main" xmlns:w14="http://schemas.microsoft.com/office/word/2010/wordml" xmlns:w15="http://schemas.microsoft.com/office/word/2012/wordml" xmlns:w16cex="http://schemas.microsoft.com/office/word/2018/wordml/cex" xmlns:w16cid="http://schemas.microsoft.com/office/word/2016/wordml/cid" xmlns:w16="http://schemas.microsoft.com/office/word/2018/wordml" xmlns:w16sdtdh="http://schemas.microsoft.com/office/word/2020/wordml/sdtdatahash" xmlns:w16se="http://schemas.microsoft.com/office/word/2015/wordml/symex" xmlns:wpg="http://schemas.microsoft.com/office/word/2010/wordprocessingGroup" xmlns:wpi="http://schemas.microsoft.com/office/word/2010/wordprocessingInk" xmlns:wne="http://schemas.microsoft.com/office/word/2006/wordml" xmlns:wps="http://schemas.microsoft.com/office/word/2010/wordprocessingShape" mc:Ignorable="w14 w15 w16se w16cid w16 w16cex w16sdtdh wp14">
   <w:footnote w:type="separator" w:id="-1">
     <w:p>
       <w:r>
@@ -3709,7 +3774,7 @@
 </file>
 
 <file path=word/header1.xml><?xml version="1.0" encoding="utf-8"?>
-<w:hdr xmlns:wpc="http://schemas.microsoft.com/office/word/2010/wordprocessingCanvas" xmlns:cx="http://schemas.microsoft.com/office/drawing/2014/chartex" xmlns:mc="http://schemas.openxmlformats.org/markup-compatibility/2006" xmlns:o="urn:schemas-microsoft-com:office:office" xmlns:r="http://schemas.openxmlformats.org/officeDocument/2006/relationships" xmlns:m="http://schemas.openxmlformats.org/officeDocument/2006/math" xmlns:v="urn:schemas-microsoft-com:vml" xmlns:wp14="http://schemas.microsoft.com/office/word/2010/wordprocessingDrawing" xmlns:wp="http://schemas.openxmlformats.org/drawingml/2006/wordprocessingDrawing" xmlns:w10="urn:schemas-microsoft-com:office:word" xmlns:w="http://schemas.openxmlformats.org/wordprocessingml/2006/main" xmlns:w14="http://schemas.microsoft.com/office/word/2010/wordml" xmlns:w15="http://schemas.microsoft.com/office/word/2012/wordml" xmlns:w16se="http://schemas.microsoft.com/office/word/2015/wordml/symex" xmlns:wpg="http://schemas.microsoft.com/office/word/2010/wordprocessingGroup" xmlns:wpi="http://schemas.microsoft.com/office/word/2010/wordprocessingInk" xmlns:wne="http://schemas.microsoft.com/office/word/2006/wordml" xmlns:wps="http://schemas.microsoft.com/office/word/2010/wordprocessingShape" mc:Ignorable="w14 w15 w16se wp14">
+<w:hdr xmlns:wpc="http://schemas.microsoft.com/office/word/2010/wordprocessingCanvas" xmlns:cx="http://schemas.microsoft.com/office/drawing/2014/chartex" xmlns:cx1="http://schemas.microsoft.com/office/drawing/2015/9/8/chartex" xmlns:cx2="http://schemas.microsoft.com/office/drawing/2015/10/21/chartex" xmlns:cx3="http://schemas.microsoft.com/office/drawing/2016/5/9/chartex" xmlns:cx4="http://schemas.microsoft.com/office/drawing/2016/5/10/chartex" xmlns:cx5="http://schemas.microsoft.com/office/drawing/2016/5/11/chartex" xmlns:cx6="http://schemas.microsoft.com/office/drawing/2016/5/12/chartex" xmlns:cx7="http://schemas.microsoft.com/office/drawing/2016/5/13/chartex" xmlns:cx8="http://schemas.microsoft.com/office/drawing/2016/5/14/chartex" xmlns:mc="http://schemas.openxmlformats.org/markup-compatibility/2006" xmlns:aink="http://schemas.microsoft.com/office/drawing/2016/ink" xmlns:am3d="http://schemas.microsoft.com/office/drawing/2017/model3d" xmlns:o="urn:schemas-microsoft-com:office:office" xmlns:oel="http://schemas.microsoft.com/office/2019/extlst" xmlns:r="http://schemas.openxmlformats.org/officeDocument/2006/relationships" xmlns:m="http://schemas.openxmlformats.org/officeDocument/2006/math" xmlns:v="urn:schemas-microsoft-com:vml" xmlns:wp14="http://schemas.microsoft.com/office/word/2010/wordprocessingDrawing" xmlns:wp="http://schemas.openxmlformats.org/drawingml/2006/wordprocessingDrawing" xmlns:w10="urn:schemas-microsoft-com:office:word" xmlns:w="http://schemas.openxmlformats.org/wordprocessingml/2006/main" xmlns:w14="http://schemas.microsoft.com/office/word/2010/wordml" xmlns:w15="http://schemas.microsoft.com/office/word/2012/wordml" xmlns:w16cex="http://schemas.microsoft.com/office/word/2018/wordml/cex" xmlns:w16cid="http://schemas.microsoft.com/office/word/2016/wordml/cid" xmlns:w16="http://schemas.microsoft.com/office/word/2018/wordml" xmlns:w16sdtdh="http://schemas.microsoft.com/office/word/2020/wordml/sdtdatahash" xmlns:w16se="http://schemas.microsoft.com/office/word/2015/wordml/symex" xmlns:wpg="http://schemas.microsoft.com/office/word/2010/wordprocessingGroup" xmlns:wpi="http://schemas.microsoft.com/office/word/2010/wordprocessingInk" xmlns:wne="http://schemas.microsoft.com/office/word/2006/wordml" xmlns:wps="http://schemas.microsoft.com/office/word/2010/wordprocessingShape" mc:Ignorable="w14 w15 w16se w16cid w16 w16cex w16sdtdh wp14">
   <w:p>
     <w:pPr>
       <w:pStyle w:val="Textoindependiente"/>
@@ -3724,96 +3789,57 @@
         <w:b w:val="0"/>
         <w:noProof/>
         <w:sz w:val="20"/>
-        <w:lang w:val="es-MX" w:eastAsia="es-MX"/>
       </w:rPr>
-      <mc:AlternateContent>
-        <mc:Choice Requires="wps">
-          <w:drawing>
-            <wp:anchor distT="0" distB="0" distL="0" distR="0" simplePos="0" relativeHeight="487457280" behindDoc="1" locked="0" layoutInCell="1" allowOverlap="1" wp14:anchorId="1CD34177" wp14:editId="6F83416D">
-              <wp:simplePos x="0" y="0"/>
-              <wp:positionH relativeFrom="page">
-                <wp:posOffset>381000</wp:posOffset>
-              </wp:positionH>
-              <wp:positionV relativeFrom="page">
-                <wp:posOffset>457200</wp:posOffset>
-              </wp:positionV>
-              <wp:extent cx="6985000" cy="467995"/>
-              <wp:effectExtent l="0" t="0" r="0" b="0"/>
-              <wp:wrapNone/>
-              <wp:docPr id="1" name="Graphic 1"/>
-              <wp:cNvGraphicFramePr>
-                <a:graphicFrameLocks xmlns:a="http://schemas.openxmlformats.org/drawingml/2006/main"/>
-              </wp:cNvGraphicFramePr>
-              <a:graphic xmlns:a="http://schemas.openxmlformats.org/drawingml/2006/main">
-                <a:graphicData uri="http://schemas.microsoft.com/office/word/2010/wordprocessingShape">
-                  <wps:wsp>
-                    <wps:cNvSpPr>
-                      <a:spLocks/>
-                    </wps:cNvSpPr>
-                    <wps:spPr>
-                      <a:xfrm>
-                        <a:off x="0" y="0"/>
-                        <a:ext cx="6985000" cy="467995"/>
-                      </a:xfrm>
-                      <a:custGeom>
-                        <a:avLst/>
-                        <a:gdLst/>
-                        <a:ahLst/>
-                        <a:cxnLst/>
-                        <a:rect l="l" t="t" r="r" b="b"/>
-                        <a:pathLst>
-                          <a:path w="6985000" h="467995">
-                            <a:moveTo>
-                              <a:pt x="6985000" y="0"/>
-                            </a:moveTo>
-                            <a:lnTo>
-                              <a:pt x="0" y="0"/>
-                            </a:lnTo>
-                            <a:lnTo>
-                              <a:pt x="0" y="467969"/>
-                            </a:lnTo>
-                            <a:lnTo>
-                              <a:pt x="6985000" y="467969"/>
-                            </a:lnTo>
-                            <a:lnTo>
-                              <a:pt x="6985000" y="0"/>
-                            </a:lnTo>
-                            <a:close/>
-                          </a:path>
-                        </a:pathLst>
-                      </a:custGeom>
-                      <a:solidFill>
-                        <a:srgbClr val="2D3539"/>
-                      </a:solidFill>
-                    </wps:spPr>
-                    <wps:bodyPr wrap="square" lIns="0" tIns="0" rIns="0" bIns="0" rtlCol="0">
-                      <a:prstTxWarp prst="textNoShape">
-                        <a:avLst/>
-                      </a:prstTxWarp>
-                      <a:noAutofit/>
-                    </wps:bodyPr>
-                  </wps:wsp>
-                </a:graphicData>
-              </a:graphic>
-            </wp:anchor>
-          </w:drawing>
-        </mc:Choice>
-        <mc:Fallback xmlns:w16sdtfl="http://schemas.microsoft.com/office/word/2024/wordml/sdtformatlock" xmlns:w16sdtdh="http://schemas.microsoft.com/office/word/2020/wordml/sdtdatahash" xmlns:w16du="http://schemas.microsoft.com/office/word/2023/wordml/word16du" xmlns:w16="http://schemas.microsoft.com/office/word/2018/wordml" xmlns:w16cid="http://schemas.microsoft.com/office/word/2016/wordml/cid" xmlns:w16cex="http://schemas.microsoft.com/office/word/2018/wordml/cex" xmlns:oel="http://schemas.microsoft.com/office/2019/extlst" xmlns:am3d="http://schemas.microsoft.com/office/drawing/2017/model3d" xmlns:aink="http://schemas.microsoft.com/office/drawing/2016/ink" xmlns:cx8="http://schemas.microsoft.com/office/drawing/2016/5/14/chartex" xmlns:cx7="http://schemas.microsoft.com/office/drawing/2016/5/13/chartex" xmlns:cx6="http://schemas.microsoft.com/office/drawing/2016/5/12/chartex" xmlns:cx5="http://schemas.microsoft.com/office/drawing/2016/5/11/chartex" xmlns:cx4="http://schemas.microsoft.com/office/drawing/2016/5/10/chartex" xmlns:cx3="http://schemas.microsoft.com/office/drawing/2016/5/9/chartex" xmlns:cx2="http://schemas.microsoft.com/office/drawing/2015/10/21/chartex" xmlns:cx1="http://schemas.microsoft.com/office/drawing/2015/9/8/chartex">
-          <w:pict>
-            <v:shape w14:anchorId="75DB765F" id="Graphic 1" o:spid="_x0000_s1026" style="position:absolute;margin-left:30pt;margin-top:36pt;width:550pt;height:36.85pt;z-index:-15859200;visibility:visible;mso-wrap-style:square;mso-wrap-distance-left:0;mso-wrap-distance-top:0;mso-wrap-distance-right:0;mso-wrap-distance-bottom:0;mso-position-horizontal:absolute;mso-position-horizontal-relative:page;mso-position-vertical:absolute;mso-position-vertical-relative:page;v-text-anchor:top" coordsize="6985000,467995" o:gfxdata="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" path="m6985000,l,,,467969r6985000,l6985000,xe" fillcolor="#2d3539" stroked="f">
-              <v:path arrowok="t"/>
-              <w10:wrap anchorx="page" anchory="page"/>
-            </v:shape>
-          </w:pict>
-        </mc:Fallback>
-      </mc:AlternateContent>
+      <w:drawing>
+        <wp:anchor distT="0" distB="0" distL="0" distR="0" simplePos="0" relativeHeight="487460352" behindDoc="1" locked="0" layoutInCell="1" allowOverlap="1" wp14:anchorId="57749E22" wp14:editId="3C9F146F">
+          <wp:simplePos x="0" y="0"/>
+          <wp:positionH relativeFrom="margin">
+            <wp:posOffset>170180</wp:posOffset>
+          </wp:positionH>
+          <wp:positionV relativeFrom="page">
+            <wp:posOffset>219075</wp:posOffset>
+          </wp:positionV>
+          <wp:extent cx="6974840" cy="1099820"/>
+          <wp:effectExtent l="0" t="0" r="0" b="5080"/>
+          <wp:wrapNone/>
+          <wp:docPr id="70" name="Image 1"/>
+          <wp:cNvGraphicFramePr>
+            <a:graphicFrameLocks xmlns:a="http://schemas.openxmlformats.org/drawingml/2006/main"/>
+          </wp:cNvGraphicFramePr>
+          <a:graphic xmlns:a="http://schemas.openxmlformats.org/drawingml/2006/main">
+            <a:graphicData uri="http://schemas.openxmlformats.org/drawingml/2006/picture">
+              <pic:pic xmlns:pic="http://schemas.openxmlformats.org/drawingml/2006/picture">
+                <pic:nvPicPr>
+                  <pic:cNvPr id="1" name="Image 1"/>
+                  <pic:cNvPicPr/>
+                </pic:nvPicPr>
+                <pic:blipFill>
+                  <a:blip r:embed="rId1" cstate="print"/>
+                  <a:stretch>
+                    <a:fillRect/>
+                  </a:stretch>
+                </pic:blipFill>
+                <pic:spPr>
+                  <a:xfrm>
+                    <a:off x="0" y="0"/>
+                    <a:ext cx="6974840" cy="1099820"/>
+                  </a:xfrm>
+                  <a:prstGeom prst="rect">
+                    <a:avLst/>
+                  </a:prstGeom>
+                </pic:spPr>
+              </pic:pic>
+            </a:graphicData>
+          </a:graphic>
+        </wp:anchor>
+      </w:drawing>
     </w:r>
   </w:p>
 </w:hdr>
 </file>
 
 <file path=word/styles.xml><?xml version="1.0" encoding="utf-8"?>
-<w:styles xmlns:mc="http://schemas.openxmlformats.org/markup-compatibility/2006" xmlns:r="http://schemas.openxmlformats.org/officeDocument/2006/relationships" xmlns:w="http://schemas.openxmlformats.org/wordprocessingml/2006/main" xmlns:w14="http://schemas.microsoft.com/office/word/2010/wordml" xmlns:w15="http://schemas.microsoft.com/office/word/2012/wordml" xmlns:w16se="http://schemas.microsoft.com/office/word/2015/wordml/symex" mc:Ignorable="w14 w15 w16se">
+<w:styles xmlns:mc="http://schemas.openxmlformats.org/markup-compatibility/2006" xmlns:r="http://schemas.openxmlformats.org/officeDocument/2006/relationships" xmlns:w="http://schemas.openxmlformats.org/wordprocessingml/2006/main" xmlns:w14="http://schemas.microsoft.com/office/word/2010/wordml" xmlns:w15="http://schemas.microsoft.com/office/word/2012/wordml" xmlns:w16cex="http://schemas.microsoft.com/office/word/2018/wordml/cex" xmlns:w16cid="http://schemas.microsoft.com/office/word/2016/wordml/cid" xmlns:w16="http://schemas.microsoft.com/office/word/2018/wordml" xmlns:w16sdtdh="http://schemas.microsoft.com/office/word/2020/wordml/sdtdatahash" xmlns:w16se="http://schemas.microsoft.com/office/word/2015/wordml/symex" mc:Ignorable="w14 w15 w16se w16cid w16 w16cex w16sdtdh">
   <w:docDefaults>
     <w:rPrDefault>
       <w:rPr>
@@ -3831,7 +3857,7 @@
       </w:pPr>
     </w:pPrDefault>
   </w:docDefaults>
-  <w:latentStyles w:defLockedState="0" w:defUIPriority="99" w:defSemiHidden="0" w:defUnhideWhenUsed="0" w:defQFormat="0" w:count="371">
+  <w:latentStyles w:defLockedState="0" w:defUIPriority="99" w:defSemiHidden="0" w:defUnhideWhenUsed="0" w:defQFormat="0" w:count="376">
     <w:lsdException w:name="Normal" w:uiPriority="0" w:qFormat="1"/>
     <w:lsdException w:name="heading 1" w:uiPriority="9" w:qFormat="1"/>
     <w:lsdException w:name="heading 2" w:semiHidden="1" w:uiPriority="9" w:unhideWhenUsed="1" w:qFormat="1"/>
@@ -4203,6 +4229,11 @@
     <w:lsdException w:name="List Table 5 Dark Accent 6" w:uiPriority="50"/>
     <w:lsdException w:name="List Table 6 Colorful Accent 6" w:uiPriority="51"/>
     <w:lsdException w:name="List Table 7 Colorful Accent 6" w:uiPriority="52"/>
+    <w:lsdException w:name="Mention" w:semiHidden="1" w:unhideWhenUsed="1"/>
+    <w:lsdException w:name="Smart Hyperlink" w:semiHidden="1" w:unhideWhenUsed="1"/>
+    <w:lsdException w:name="Hashtag" w:semiHidden="1" w:unhideWhenUsed="1"/>
+    <w:lsdException w:name="Unresolved Mention" w:semiHidden="1" w:unhideWhenUsed="1"/>
+    <w:lsdException w:name="Smart Link" w:semiHidden="1" w:unhideWhenUsed="1"/>
   </w:latentStyles>
   <w:style w:type="paragraph" w:default="1" w:styleId="Normal">
     <w:name w:val="Normal"/>

</xml_diff>